<commit_message>
Cambios sobre el repaso antes de la presentación
</commit_message>
<xml_diff>
--- a/documentacion/Proyecto-Alejandro-Fernandez.docx
+++ b/documentacion/Proyecto-Alejandro-Fernandez.docx
@@ -608,31 +608,93 @@
       </w:r>
     </w:p>
     <w:p>
-      <w:r>
+      <w:pPr>
+        <w:pStyle w:val="ListParagraph"/>
+        <w:numPr>
+          <w:ilvl w:val="0"/>
+          <w:numId w:val="2"/>
+        </w:numPr>
+      </w:pPr>
+    </w:p>
+    <w:p>
+      <w:pPr>
+        <w:rPr>
+          <w:b/>
+          <w:bCs/>
+          <w:sz w:val="28"/>
+          <w:szCs w:val="28"/>
+        </w:rPr>
+      </w:pPr>
+      <w:r>
+        <w:rPr>
+          <w:b/>
+          <w:bCs/>
+          <w:sz w:val="28"/>
+          <w:szCs w:val="28"/>
+        </w:rPr>
         <w:t>Script SQL Principal</w:t>
       </w:r>
       <w:r>
-        <w:t xml:space="preserve"> Base Da</w:t>
-      </w:r>
-      <w:r>
-        <w:t>tos</w:t>
-      </w:r>
-    </w:p>
-    <w:p>
-      <w:pPr>
-        <w:spacing w:line="240" w:lineRule="auto"/>
-        <w:rPr>
-          <w:sz w:val="16"/>
-          <w:szCs w:val="16"/>
+        <w:rPr>
+          <w:b/>
+          <w:bCs/>
+          <w:sz w:val="28"/>
+          <w:szCs w:val="28"/>
+        </w:rPr>
+        <w:t xml:space="preserve"> Base Datos</w:t>
+      </w:r>
+    </w:p>
+    <w:p>
+      <w:pPr>
+        <w:rPr>
           <w:lang w:val="en-US"/>
         </w:rPr>
       </w:pPr>
       <w:r>
         <w:rPr>
-          <w:sz w:val="16"/>
-          <w:szCs w:val="16"/>
           <w:lang w:val="en-US"/>
         </w:rPr>
+        <w:t>CREATE DATABASE IF NOT EXISTS</w:t>
+      </w:r>
+      <w:r>
+        <w:rPr>
+          <w:lang w:val="en-US"/>
+        </w:rPr>
+        <w:t xml:space="preserve"> club_deportivo</w:t>
+      </w:r>
+      <w:r>
+        <w:rPr>
+          <w:lang w:val="en-US"/>
+        </w:rPr>
+        <w:t>;</w:t>
+      </w:r>
+    </w:p>
+    <w:p>
+      <w:r>
+        <w:t>USE</w:t>
+      </w:r>
+      <w:r>
+        <w:t xml:space="preserve"> club_deporti</w:t>
+      </w:r>
+      <w:r>
+        <w:t>vo</w:t>
+      </w:r>
+      <w:r>
+        <w:t>;</w:t>
+      </w:r>
+    </w:p>
+    <w:p/>
+    <w:p>
+      <w:pPr>
+        <w:spacing w:line="240" w:lineRule="auto"/>
+        <w:rPr>
+          <w:lang w:val="en-US"/>
+        </w:rPr>
+      </w:pPr>
+      <w:r>
+        <w:rPr>
+          <w:lang w:val="en-US"/>
+        </w:rPr>
         <w:t xml:space="preserve">CREATE TABLE usuarios (id INT AUTO_INCREMENT PRIMARY KEY,    </w:t>
       </w:r>
     </w:p>
@@ -641,15 +703,11 @@
         <w:spacing w:line="240" w:lineRule="auto"/>
         <w:ind w:firstLine="708"/>
         <w:rPr>
-          <w:sz w:val="16"/>
-          <w:szCs w:val="16"/>
           <w:lang w:val="en-US"/>
         </w:rPr>
       </w:pPr>
       <w:r>
         <w:rPr>
-          <w:sz w:val="16"/>
-          <w:szCs w:val="16"/>
           <w:lang w:val="en-US"/>
         </w:rPr>
         <w:t>username VARCHAR(50) UNIQUE NOT NULL,</w:t>
@@ -659,16 +717,8 @@
       <w:pPr>
         <w:spacing w:line="240" w:lineRule="auto"/>
         <w:ind w:firstLine="708"/>
-        <w:rPr>
-          <w:sz w:val="16"/>
-          <w:szCs w:val="16"/>
-        </w:rPr>
-      </w:pPr>
-      <w:r>
-        <w:rPr>
-          <w:sz w:val="16"/>
-          <w:szCs w:val="16"/>
-        </w:rPr>
+      </w:pPr>
+      <w:r>
         <w:t xml:space="preserve">password VARCHAR(100) NOT NULL,    </w:t>
       </w:r>
     </w:p>
@@ -676,16 +726,8 @@
       <w:pPr>
         <w:spacing w:line="240" w:lineRule="auto"/>
         <w:ind w:firstLine="708"/>
-        <w:rPr>
-          <w:sz w:val="16"/>
-          <w:szCs w:val="16"/>
-        </w:rPr>
-      </w:pPr>
-      <w:r>
-        <w:rPr>
-          <w:sz w:val="16"/>
-          <w:szCs w:val="16"/>
-        </w:rPr>
+      </w:pPr>
+      <w:r>
         <w:t xml:space="preserve">email VARCHAR(100),    nombre VARCHAR(50),    </w:t>
       </w:r>
     </w:p>
@@ -693,16 +735,8 @@
       <w:pPr>
         <w:spacing w:line="240" w:lineRule="auto"/>
         <w:ind w:firstLine="708"/>
-        <w:rPr>
-          <w:sz w:val="16"/>
-          <w:szCs w:val="16"/>
-        </w:rPr>
-      </w:pPr>
-      <w:r>
-        <w:rPr>
-          <w:sz w:val="16"/>
-          <w:szCs w:val="16"/>
-        </w:rPr>
+      </w:pPr>
+      <w:r>
         <w:t xml:space="preserve">apellidos VARCHAR(50),    </w:t>
       </w:r>
     </w:p>
@@ -710,62 +744,35 @@
       <w:pPr>
         <w:spacing w:line="240" w:lineRule="auto"/>
         <w:ind w:firstLine="708"/>
-        <w:rPr>
-          <w:sz w:val="16"/>
-          <w:szCs w:val="16"/>
-        </w:rPr>
-      </w:pPr>
-      <w:r>
-        <w:rPr>
-          <w:sz w:val="16"/>
-          <w:szCs w:val="16"/>
-        </w:rPr>
+      </w:pPr>
+      <w:r>
         <w:t>rol ENUM('JUGADOR', 'ENTRENADOR')</w:t>
       </w:r>
     </w:p>
     <w:p>
       <w:pPr>
         <w:spacing w:line="240" w:lineRule="auto"/>
-        <w:rPr>
-          <w:sz w:val="16"/>
-          <w:szCs w:val="16"/>
-        </w:rPr>
-      </w:pPr>
-      <w:r>
-        <w:rPr>
-          <w:sz w:val="16"/>
-          <w:szCs w:val="16"/>
-        </w:rPr>
+      </w:pPr>
+      <w:r>
         <w:t>);</w:t>
       </w:r>
     </w:p>
     <w:p>
       <w:pPr>
         <w:spacing w:line="240" w:lineRule="auto"/>
-        <w:rPr>
-          <w:sz w:val="16"/>
-          <w:szCs w:val="16"/>
-        </w:rPr>
-      </w:pPr>
-      <w:r>
-        <w:rPr>
-          <w:sz w:val="16"/>
-          <w:szCs w:val="16"/>
-        </w:rPr>
+      </w:pPr>
+    </w:p>
+    <w:p>
+      <w:pPr>
+        <w:spacing w:line="240" w:lineRule="auto"/>
+      </w:pPr>
+      <w:r>
         <w:t>CREATE TABLE jugadores</w:t>
       </w:r>
       <w:r>
-        <w:rPr>
-          <w:sz w:val="16"/>
-          <w:szCs w:val="16"/>
-        </w:rPr>
         <w:t xml:space="preserve"> </w:t>
       </w:r>
       <w:r>
-        <w:rPr>
-          <w:sz w:val="16"/>
-          <w:szCs w:val="16"/>
-        </w:rPr>
         <w:t>(</w:t>
       </w:r>
     </w:p>
@@ -773,16 +780,8 @@
       <w:pPr>
         <w:spacing w:line="240" w:lineRule="auto"/>
         <w:ind w:left="708"/>
-        <w:rPr>
-          <w:sz w:val="16"/>
-          <w:szCs w:val="16"/>
-        </w:rPr>
-      </w:pPr>
-      <w:r>
-        <w:rPr>
-          <w:sz w:val="16"/>
-          <w:szCs w:val="16"/>
-        </w:rPr>
+      </w:pPr>
+      <w:r>
         <w:t xml:space="preserve">usuario_id INT PRIMARY KEY,    </w:t>
       </w:r>
     </w:p>
@@ -790,16 +789,8 @@
       <w:pPr>
         <w:spacing w:line="240" w:lineRule="auto"/>
         <w:ind w:left="708"/>
-        <w:rPr>
-          <w:sz w:val="16"/>
-          <w:szCs w:val="16"/>
-        </w:rPr>
-      </w:pPr>
-      <w:r>
-        <w:rPr>
-          <w:sz w:val="16"/>
-          <w:szCs w:val="16"/>
-        </w:rPr>
+      </w:pPr>
+      <w:r>
         <w:t xml:space="preserve">posicion VARCHAR(50),    </w:t>
       </w:r>
     </w:p>
@@ -807,16 +798,8 @@
       <w:pPr>
         <w:spacing w:line="240" w:lineRule="auto"/>
         <w:ind w:left="708"/>
-        <w:rPr>
-          <w:sz w:val="16"/>
-          <w:szCs w:val="16"/>
-        </w:rPr>
-      </w:pPr>
-      <w:r>
-        <w:rPr>
-          <w:sz w:val="16"/>
-          <w:szCs w:val="16"/>
-        </w:rPr>
+      </w:pPr>
+      <w:r>
         <w:t xml:space="preserve">dorsal INT,    </w:t>
       </w:r>
     </w:p>
@@ -824,48 +807,29 @@
       <w:pPr>
         <w:spacing w:line="240" w:lineRule="auto"/>
         <w:ind w:left="708"/>
-        <w:rPr>
-          <w:sz w:val="16"/>
-          <w:szCs w:val="16"/>
-        </w:rPr>
-      </w:pPr>
-      <w:r>
-        <w:rPr>
-          <w:sz w:val="16"/>
-          <w:szCs w:val="16"/>
-        </w:rPr>
+      </w:pPr>
+      <w:r>
         <w:t>FOREIGN KEY (usuario_id) REFERENCES usuarios(id) ON DELETE CASCADE</w:t>
       </w:r>
     </w:p>
     <w:p>
       <w:pPr>
         <w:spacing w:line="240" w:lineRule="auto"/>
-        <w:rPr>
-          <w:sz w:val="16"/>
-          <w:szCs w:val="16"/>
-        </w:rPr>
-      </w:pPr>
-      <w:r>
-        <w:rPr>
-          <w:sz w:val="16"/>
-          <w:szCs w:val="16"/>
-        </w:rPr>
+      </w:pPr>
+      <w:r>
         <w:t>);</w:t>
       </w:r>
     </w:p>
     <w:p>
       <w:pPr>
         <w:spacing w:line="240" w:lineRule="auto"/>
-        <w:rPr>
-          <w:sz w:val="16"/>
-          <w:szCs w:val="16"/>
-        </w:rPr>
-      </w:pPr>
-      <w:r>
-        <w:rPr>
-          <w:sz w:val="16"/>
-          <w:szCs w:val="16"/>
-        </w:rPr>
+      </w:pPr>
+    </w:p>
+    <w:p>
+      <w:pPr>
+        <w:spacing w:line="240" w:lineRule="auto"/>
+      </w:pPr>
+      <w:r>
         <w:t>CREATE TABLE entrenadores (</w:t>
       </w:r>
     </w:p>
@@ -873,16 +837,8 @@
       <w:pPr>
         <w:spacing w:line="240" w:lineRule="auto"/>
         <w:ind w:firstLine="708"/>
-        <w:rPr>
-          <w:sz w:val="16"/>
-          <w:szCs w:val="16"/>
-        </w:rPr>
-      </w:pPr>
-      <w:r>
-        <w:rPr>
-          <w:sz w:val="16"/>
-          <w:szCs w:val="16"/>
-        </w:rPr>
+      </w:pPr>
+      <w:r>
         <w:t xml:space="preserve">usuario_id INT PRIMARY KEY,    </w:t>
       </w:r>
     </w:p>
@@ -890,16 +846,8 @@
       <w:pPr>
         <w:spacing w:line="240" w:lineRule="auto"/>
         <w:ind w:firstLine="708"/>
-        <w:rPr>
-          <w:sz w:val="16"/>
-          <w:szCs w:val="16"/>
-        </w:rPr>
-      </w:pPr>
-      <w:r>
-        <w:rPr>
-          <w:sz w:val="16"/>
-          <w:szCs w:val="16"/>
-        </w:rPr>
+      </w:pPr>
+      <w:r>
         <w:t xml:space="preserve">especialidad VARCHAR(50),    </w:t>
       </w:r>
     </w:p>
@@ -907,16 +855,8 @@
       <w:pPr>
         <w:spacing w:line="240" w:lineRule="auto"/>
         <w:ind w:firstLine="708"/>
-        <w:rPr>
-          <w:sz w:val="16"/>
-          <w:szCs w:val="16"/>
-        </w:rPr>
-      </w:pPr>
-      <w:r>
-        <w:rPr>
-          <w:sz w:val="16"/>
-          <w:szCs w:val="16"/>
-        </w:rPr>
+      </w:pPr>
+      <w:r>
         <w:t xml:space="preserve">experiencia_anios INT,    </w:t>
       </w:r>
     </w:p>
@@ -924,48 +864,25 @@
       <w:pPr>
         <w:spacing w:line="240" w:lineRule="auto"/>
         <w:ind w:firstLine="708"/>
-        <w:rPr>
-          <w:sz w:val="16"/>
-          <w:szCs w:val="16"/>
-        </w:rPr>
-      </w:pPr>
-      <w:r>
-        <w:rPr>
-          <w:sz w:val="16"/>
-          <w:szCs w:val="16"/>
-        </w:rPr>
+      </w:pPr>
+      <w:r>
         <w:t>FOREIGN KEY (usuario_id) REFERENCES usuarios(id) ON DELETE CASCADE</w:t>
       </w:r>
     </w:p>
     <w:p>
       <w:pPr>
         <w:spacing w:line="240" w:lineRule="auto"/>
-        <w:rPr>
-          <w:sz w:val="16"/>
-          <w:szCs w:val="16"/>
-        </w:rPr>
-      </w:pPr>
-      <w:r>
-        <w:rPr>
-          <w:sz w:val="16"/>
-          <w:szCs w:val="16"/>
-        </w:rPr>
+      </w:pPr>
+      <w:r>
         <w:t>);</w:t>
       </w:r>
     </w:p>
     <w:p>
       <w:pPr>
         <w:spacing w:line="240" w:lineRule="auto"/>
-        <w:rPr>
-          <w:sz w:val="16"/>
-          <w:szCs w:val="16"/>
-        </w:rPr>
-      </w:pPr>
-      <w:r>
-        <w:rPr>
-          <w:sz w:val="16"/>
-          <w:szCs w:val="16"/>
-        </w:rPr>
+      </w:pPr>
+      <w:r>
+        <w:lastRenderedPageBreak/>
         <w:t xml:space="preserve">CREATE TABLE equipos (    </w:t>
       </w:r>
     </w:p>
@@ -973,16 +890,8 @@
       <w:pPr>
         <w:spacing w:line="240" w:lineRule="auto"/>
         <w:ind w:firstLine="708"/>
-        <w:rPr>
-          <w:sz w:val="16"/>
-          <w:szCs w:val="16"/>
-        </w:rPr>
-      </w:pPr>
-      <w:r>
-        <w:rPr>
-          <w:sz w:val="16"/>
-          <w:szCs w:val="16"/>
-        </w:rPr>
+      </w:pPr>
+      <w:r>
         <w:t xml:space="preserve">id INT AUTO_INCREMENT PRIMARY KEY,    </w:t>
       </w:r>
     </w:p>
@@ -990,16 +899,8 @@
       <w:pPr>
         <w:spacing w:line="240" w:lineRule="auto"/>
         <w:ind w:firstLine="708"/>
-        <w:rPr>
-          <w:sz w:val="16"/>
-          <w:szCs w:val="16"/>
-        </w:rPr>
-      </w:pPr>
-      <w:r>
-        <w:rPr>
-          <w:sz w:val="16"/>
-          <w:szCs w:val="16"/>
-        </w:rPr>
+      </w:pPr>
+      <w:r>
         <w:t xml:space="preserve">nombre VARCHAR(100) NOT NULL,    </w:t>
       </w:r>
     </w:p>
@@ -1007,48 +908,29 @@
       <w:pPr>
         <w:spacing w:line="240" w:lineRule="auto"/>
         <w:ind w:firstLine="708"/>
-        <w:rPr>
-          <w:sz w:val="16"/>
-          <w:szCs w:val="16"/>
-        </w:rPr>
-      </w:pPr>
-      <w:r>
-        <w:rPr>
-          <w:sz w:val="16"/>
-          <w:szCs w:val="16"/>
-        </w:rPr>
+      </w:pPr>
+      <w:r>
         <w:t>categoria VARCHAR(50)</w:t>
       </w:r>
     </w:p>
     <w:p>
       <w:pPr>
         <w:spacing w:line="240" w:lineRule="auto"/>
-        <w:rPr>
-          <w:sz w:val="16"/>
-          <w:szCs w:val="16"/>
-        </w:rPr>
-      </w:pPr>
-      <w:r>
-        <w:rPr>
-          <w:sz w:val="16"/>
-          <w:szCs w:val="16"/>
-        </w:rPr>
+      </w:pPr>
+      <w:r>
         <w:t>);</w:t>
       </w:r>
     </w:p>
     <w:p>
       <w:pPr>
         <w:spacing w:line="240" w:lineRule="auto"/>
-        <w:rPr>
-          <w:sz w:val="16"/>
-          <w:szCs w:val="16"/>
-        </w:rPr>
-      </w:pPr>
-      <w:r>
-        <w:rPr>
-          <w:sz w:val="16"/>
-          <w:szCs w:val="16"/>
-        </w:rPr>
+      </w:pPr>
+    </w:p>
+    <w:p>
+      <w:pPr>
+        <w:spacing w:line="240" w:lineRule="auto"/>
+      </w:pPr>
+      <w:r>
         <w:t xml:space="preserve">CREATE TABLE fichajes (    </w:t>
       </w:r>
     </w:p>
@@ -1056,16 +938,8 @@
       <w:pPr>
         <w:spacing w:line="240" w:lineRule="auto"/>
         <w:ind w:firstLine="708"/>
-        <w:rPr>
-          <w:sz w:val="16"/>
-          <w:szCs w:val="16"/>
-        </w:rPr>
-      </w:pPr>
-      <w:r>
-        <w:rPr>
-          <w:sz w:val="16"/>
-          <w:szCs w:val="16"/>
-        </w:rPr>
+      </w:pPr>
+      <w:r>
         <w:t xml:space="preserve">jugador_id INT,    </w:t>
       </w:r>
     </w:p>
@@ -1073,16 +947,8 @@
       <w:pPr>
         <w:spacing w:line="240" w:lineRule="auto"/>
         <w:ind w:firstLine="708"/>
-        <w:rPr>
-          <w:sz w:val="16"/>
-          <w:szCs w:val="16"/>
-        </w:rPr>
-      </w:pPr>
-      <w:r>
-        <w:rPr>
-          <w:sz w:val="16"/>
-          <w:szCs w:val="16"/>
-        </w:rPr>
+      </w:pPr>
+      <w:r>
         <w:t xml:space="preserve">equipo_id INT,    </w:t>
       </w:r>
     </w:p>
@@ -1090,16 +956,8 @@
       <w:pPr>
         <w:spacing w:line="240" w:lineRule="auto"/>
         <w:ind w:firstLine="708"/>
-        <w:rPr>
-          <w:sz w:val="16"/>
-          <w:szCs w:val="16"/>
-        </w:rPr>
-      </w:pPr>
-      <w:r>
-        <w:rPr>
-          <w:sz w:val="16"/>
-          <w:szCs w:val="16"/>
-        </w:rPr>
+      </w:pPr>
+      <w:r>
         <w:t xml:space="preserve">PRIMARY KEY (jugador_id, equipo_id),    </w:t>
       </w:r>
     </w:p>
@@ -1107,16 +965,8 @@
       <w:pPr>
         <w:spacing w:line="240" w:lineRule="auto"/>
         <w:ind w:left="708"/>
-        <w:rPr>
-          <w:sz w:val="16"/>
-          <w:szCs w:val="16"/>
-        </w:rPr>
-      </w:pPr>
-      <w:r>
-        <w:rPr>
-          <w:sz w:val="16"/>
-          <w:szCs w:val="16"/>
-        </w:rPr>
+      </w:pPr>
+      <w:r>
         <w:t xml:space="preserve">FOREIGN KEY (jugador_id) REFERENCES jugadores(usuario_id) ON DELETE CASCADE,    </w:t>
       </w:r>
     </w:p>
@@ -1125,26 +975,14 @@
         <w:spacing w:line="240" w:lineRule="auto"/>
         <w:ind w:left="708"/>
         <w:rPr>
-          <w:sz w:val="16"/>
-          <w:szCs w:val="16"/>
           <w:lang w:val="en-US"/>
         </w:rPr>
       </w:pPr>
       <w:r>
         <w:rPr>
-          <w:sz w:val="16"/>
-          <w:szCs w:val="16"/>
           <w:lang w:val="en-US"/>
         </w:rPr>
-        <w:t>FOREIGN KEY (equipo_id) REFERENCES equipos(id) ON DELETE CASCADE</w:t>
-      </w:r>
-      <w:r>
-        <w:rPr>
-          <w:sz w:val="16"/>
-          <w:szCs w:val="16"/>
-          <w:lang w:val="en-US"/>
-        </w:rPr>
-        <w:t>);</w:t>
+        <w:t>FOREIGN KEY (equipo_id) REFERENCES equipos(id) ON DELETE CASCADE);</w:t>
       </w:r>
     </w:p>
     <w:p>
@@ -1152,7 +990,6 @@
         <w:pStyle w:val="Heading1"/>
       </w:pPr>
       <w:r>
-        <w:lastRenderedPageBreak/>
         <w:t>4. Instrucciones de Instalación</w:t>
       </w:r>
     </w:p>
@@ -1350,13 +1187,6 @@
         </w:rPr>
         <w:t>";</w:t>
       </w:r>
-    </w:p>
-    <w:p>
-      <w:pPr>
-        <w:rPr>
-          <w:lang w:val="en-US"/>
-        </w:rPr>
-      </w:pPr>
     </w:p>
     <w:p>
       <w:pPr>
@@ -1383,34 +1213,14 @@
     </w:p>
     <w:p>
       <w:pPr>
-        <w:tabs>
-          <w:tab w:val="left" w:pos="3300"/>
-        </w:tabs>
-      </w:pPr>
-      <w:r>
-        <w:tab/>
-      </w:r>
-    </w:p>
-    <w:p>
-      <w:pPr>
-        <w:pStyle w:val="Heading1"/>
-      </w:pPr>
-      <w:r>
-        <w:t>6. Informe de WakaTime</w:t>
-      </w:r>
-    </w:p>
-    <w:p>
-      <w:r>
-        <w:t>Adjunto captura de pantalla del tiempo de desarrollo del proyecto.</w:t>
-      </w:r>
-    </w:p>
-    <w:p>
+        <w:jc w:val="center"/>
+      </w:pPr>
       <w:r>
         <w:drawing>
-          <wp:inline distT="0" distB="0" distL="0" distR="0" wp14:anchorId="62A65301" wp14:editId="3AB8FB36">
-            <wp:extent cx="5400040" cy="3035935"/>
-            <wp:effectExtent l="0" t="0" r="0" b="0"/>
-            <wp:docPr id="1" name="Picture 1"/>
+          <wp:inline distT="0" distB="0" distL="0" distR="0" wp14:anchorId="00EB3713" wp14:editId="29ABB54B">
+            <wp:extent cx="4719543" cy="2231571"/>
+            <wp:effectExtent l="0" t="0" r="5080" b="0"/>
+            <wp:docPr id="2" name="Picture 2"/>
             <wp:cNvGraphicFramePr>
               <a:graphicFrameLocks xmlns:a="http://schemas.openxmlformats.org/drawingml/2006/main" noChangeAspect="1"/>
             </wp:cNvGraphicFramePr>
@@ -1430,7 +1240,7 @@
                   <pic:spPr>
                     <a:xfrm>
                       <a:off x="0" y="0"/>
-                      <a:ext cx="5400040" cy="3035935"/>
+                      <a:ext cx="4794677" cy="2267097"/>
                     </a:xfrm>
                     <a:prstGeom prst="rect">
                       <a:avLst/>
@@ -1443,15 +1253,70 @@
         </w:drawing>
       </w:r>
     </w:p>
+    <w:p>
+      <w:r>
+        <w:br w:type="page"/>
+      </w:r>
+    </w:p>
+    <w:p>
+      <w:pPr>
+        <w:pStyle w:val="Heading1"/>
+      </w:pPr>
+      <w:r>
+        <w:lastRenderedPageBreak/>
+        <w:t>6. Informe de WakaTime</w:t>
+      </w:r>
+    </w:p>
+    <w:p>
+      <w:r>
+        <w:t>Adjunto captura de pantalla del tiempo de desarrollo del proyecto.</w:t>
+      </w:r>
+    </w:p>
+    <w:p>
+      <w:r>
+        <w:drawing>
+          <wp:inline distT="0" distB="0" distL="0" distR="0" wp14:anchorId="62A65301" wp14:editId="3FD9D755">
+            <wp:extent cx="4635221" cy="2605949"/>
+            <wp:effectExtent l="0" t="0" r="0" b="4445"/>
+            <wp:docPr id="1" name="Picture 1"/>
+            <wp:cNvGraphicFramePr>
+              <a:graphicFrameLocks xmlns:a="http://schemas.openxmlformats.org/drawingml/2006/main" noChangeAspect="1"/>
+            </wp:cNvGraphicFramePr>
+            <a:graphic xmlns:a="http://schemas.openxmlformats.org/drawingml/2006/main">
+              <a:graphicData uri="http://schemas.openxmlformats.org/drawingml/2006/picture">
+                <pic:pic xmlns:pic="http://schemas.openxmlformats.org/drawingml/2006/picture">
+                  <pic:nvPicPr>
+                    <pic:cNvPr id="1" name=""/>
+                    <pic:cNvPicPr/>
+                  </pic:nvPicPr>
+                  <pic:blipFill>
+                    <a:blip r:embed="rId10"/>
+                    <a:stretch>
+                      <a:fillRect/>
+                    </a:stretch>
+                  </pic:blipFill>
+                  <pic:spPr>
+                    <a:xfrm>
+                      <a:off x="0" y="0"/>
+                      <a:ext cx="4635221" cy="2605949"/>
+                    </a:xfrm>
+                    <a:prstGeom prst="rect">
+                      <a:avLst/>
+                    </a:prstGeom>
+                  </pic:spPr>
+                </pic:pic>
+              </a:graphicData>
+            </a:graphic>
+          </wp:inline>
+        </w:drawing>
+      </w:r>
+    </w:p>
     <w:p/>
-    <w:p/>
-    <w:p/>
     <w:p>
       <w:pPr>
         <w:pStyle w:val="Heading1"/>
       </w:pPr>
       <w:r>
-        <w:lastRenderedPageBreak/>
         <w:t>7. Extensiones Implementadas</w:t>
       </w:r>
     </w:p>
@@ -1556,8 +1421,8 @@
       </w:r>
     </w:p>
     <w:sectPr>
-      <w:headerReference w:type="default" r:id="rId10"/>
-      <w:footerReference w:type="default" r:id="rId11"/>
+      <w:headerReference w:type="default" r:id="rId11"/>
+      <w:footerReference w:type="default" r:id="rId12"/>
       <w:pgSz w:w="11906" w:h="16838"/>
       <w:pgMar w:top="1417" w:right="1701" w:bottom="1417" w:left="1701" w:header="708" w:footer="708" w:gutter="0"/>
       <w:cols w:space="708"/>

</xml_diff>